<commit_message>
feat(release): ship doc.haus 2.0
Provide a runnable local legal-document workspace with native provider setup,
durable installation settings, explicit research connector consent, and
source-grounded drafting and Word review delivery. Include first-run, storage,
migration, local container and contributor documentation.

Retain the reviewed application CI, synthetic regression coverage, component
notices and attribution. Harden credential exclusions and update the affected
provider SDK patch dependencies while preserving structured streaming errors.
</commit_message>
<xml_diff>
--- a/dochaus/templates/_base.docx
+++ b/dochaus/templates/_base.docx
@@ -22,7 +22,7 @@
     </w:rPrDefault>
     <w:pPrDefault>
       <w:pPr>
-        <w:spacing w:after="160" w:line="259" w:lineRule="auto"/>
+        <w:spacing w:after="200" w:line="276" w:lineRule="auto"/>
       </w:pPr>
     </w:pPrDefault>
   </w:docDefaults>
@@ -46,7 +46,7 @@
     <w:basedOn w:val="Normal"/>
     <w:pPr>
       <w:keepNext/>
-      <w:spacing w:before="240" w:after="80"/>
+      <w:spacing w:before="320" w:after="160"/>
       <w:outlineLvl w:val="0"/>
     </w:pPr>
     <w:rPr>
@@ -59,7 +59,7 @@
     <w:basedOn w:val="Normal"/>
     <w:pPr>
       <w:keepNext/>
-      <w:spacing w:before="160" w:after="80"/>
+      <w:spacing w:before="280" w:after="140"/>
       <w:outlineLvl w:val="1"/>
     </w:pPr>
     <w:rPr>
@@ -72,7 +72,7 @@
     <w:basedOn w:val="Normal"/>
     <w:pPr>
       <w:keepNext/>
-      <w:spacing w:before="160" w:after="80"/>
+      <w:spacing w:before="220" w:after="120"/>
       <w:outlineLvl w:val="2"/>
     </w:pPr>
     <w:rPr>
@@ -89,5 +89,12 @@
       <w:contextualSpacing/>
     </w:pPr>
   </w:style>
+  <w:style w:type="paragraph" w:styleId="Quote">
+    <w:name w:val="Quote"/>
+    <w:basedOn w:val="Normal"/>
+    <w:pPr>
+      <w:ind w:left="720" w:right="720"/>
+    </w:pPr>
+  </w:style>
 </w:styles>
 </file>
</xml_diff>

<commit_message>
feat(dochaus): Header and Footer styles in the drafting seed
Page furniture writes its header and footer paragraphs in these styles: 9 pt,
single spaced, no space after, with Word's centre and right tab stops for the
6.5-inch text width. _base.docx rebuilt with bun templates/build.ts; the
build's demo/templates/nda.docx output is no longer tracked and was discarded.
</commit_message>
<xml_diff>
--- a/dochaus/templates/_base.docx
+++ b/dochaus/templates/_base.docx
@@ -96,5 +96,33 @@
       <w:ind w:left="720" w:right="720"/>
     </w:pPr>
   </w:style>
+  <w:style w:type="paragraph" w:styleId="Header">
+    <w:name w:val="header"/>
+    <w:basedOn w:val="Normal"/>
+    <w:pPr>
+      <w:tabs>
+        <w:tab w:val="center" w:pos="4680"/>
+        <w:tab w:val="right" w:pos="9360"/>
+      </w:tabs>
+      <w:spacing w:after="0" w:line="240" w:lineRule="auto"/>
+    </w:pPr>
+    <w:rPr>
+      <w:sz w:val="18"/>
+    </w:rPr>
+  </w:style>
+  <w:style w:type="paragraph" w:styleId="Footer">
+    <w:name w:val="footer"/>
+    <w:basedOn w:val="Normal"/>
+    <w:pPr>
+      <w:tabs>
+        <w:tab w:val="center" w:pos="4680"/>
+        <w:tab w:val="right" w:pos="9360"/>
+      </w:tabs>
+      <w:spacing w:after="0" w:line="240" w:lineRule="auto"/>
+    </w:pPr>
+    <w:rPr>
+      <w:sz w:val="18"/>
+    </w:rPr>
+  </w:style>
 </w:styles>
 </file>
</xml_diff>